<commit_message>
Subindo atualizarRanking e atualizações no css do ranking
</commit_message>
<xml_diff>
--- a/Documentos do projeto/Documentaçãoautospa.docx
+++ b/Documentos do projeto/Documentaçãoautospa.docx
@@ -13,14 +13,7 @@
           <w:b/>
           <w:sz w:val="28"/>
         </w:rPr>
-        <w:t xml:space="preserve"> </w:t>
-      </w:r>
-      <w:r>
-        <w:rPr>
-          <w:b/>
-          <w:sz w:val="28"/>
-        </w:rPr>
-        <w:t>SÃO PAULO TECH SCHOOL</w:t>
+        <w:t xml:space="preserve"> SÃO PAULO TECH SCHOOL</w:t>
       </w:r>
       <w:r>
         <w:t xml:space="preserve"> </w:t>
@@ -269,14 +262,7 @@
           <w:szCs w:val="52"/>
         </w:rPr>
         <w:lastRenderedPageBreak/>
-        <w:t>SUMÁRIO</w:t>
-      </w:r>
-      <w:r>
-        <w:rPr>
-          <w:sz w:val="52"/>
-          <w:szCs w:val="52"/>
-        </w:rPr>
-        <w:t xml:space="preserve"> </w:t>
+        <w:t xml:space="preserve">SUMÁRIO </w:t>
       </w:r>
     </w:p>
     <w:p>
@@ -997,7 +983,15 @@
           <w:b/>
           <w:sz w:val="22"/>
         </w:rPr>
-        <w:t xml:space="preserve">PREMISSAS/RESTRIÇÕES:.........................................................................................7 </w:t>
+        <w:t>PREMISSAS/RESTRIÇÕES:.........................................................................................</w:t>
+      </w:r>
+      <w:proofErr w:type="gramStart"/>
+      <w:r>
+        <w:rPr>
+          <w:b/>
+          <w:sz w:val="22"/>
+        </w:rPr>
+        <w:t xml:space="preserve">7 </w:t>
       </w:r>
       <w:r>
         <w:rPr>
@@ -1012,7 +1006,15 @@
           <w:b/>
           <w:sz w:val="22"/>
         </w:rPr>
-        <w:t xml:space="preserve">Metodologia utilizada: .................................................................................................7 </w:t>
+        <w:t>Metodologia</w:t>
+      </w:r>
+      <w:proofErr w:type="gramEnd"/>
+      <w:r>
+        <w:rPr>
+          <w:b/>
+          <w:sz w:val="22"/>
+        </w:rPr>
+        <w:t xml:space="preserve"> utilizada: .................................................................................................7 </w:t>
       </w:r>
     </w:p>
     <w:p>
@@ -1227,7 +1229,13 @@
       </w:r>
       <w:proofErr w:type="spellEnd"/>
       <w:r>
-        <w:t xml:space="preserve"> consiste no desenvolvimento de um site informativo voltado à área de estética automotiva, unindo tecnologia com um interesse pessoal que surgiu desde a infância. Desde pequeno, sempre tive contato com carros, principalmente acompanhando meu pai, que realizava a lavagem dos veículos na garagem de casa. Com o tempo, essa convivência despertou em mim curiosidade e gosto por cuidar e manter os automóveis bem conservados. </w:t>
+        <w:t xml:space="preserve"> consiste no desenvolvimento de um site informativo voltado à área de estética automotiva, unindo tecnologia com um interesse pessoal que surgiu desde a</w:t>
+      </w:r>
+      <w:r>
+        <w:t xml:space="preserve"> minha</w:t>
+      </w:r>
+      <w:r>
+        <w:t xml:space="preserve"> infância. Desde pequeno, sempre tive contato com carros, principalmente acompanhando meu pai, que realizava a lavagem dos veículos na garagem de casa. Com o tempo, essa convivência despertou em mim curiosidade e gosto por cuidar e manter os automóveis bem conservados. </w:t>
       </w:r>
     </w:p>
     <w:p>
@@ -3168,7 +3176,11 @@
         <w:ind w:right="59" w:hanging="360"/>
       </w:pPr>
       <w:r>
-        <w:t xml:space="preserve">Auxiliar usuários na compreensão dos principais cuidados com veículos;  </w:t>
+        <w:t xml:space="preserve">Auxiliar usuários na compreensão dos principais cuidados com </w:t>
+      </w:r>
+      <w:proofErr w:type="gramStart"/>
+      <w:r>
+        <w:t xml:space="preserve">veículos;  </w:t>
       </w:r>
       <w:r>
         <w:rPr>
@@ -3177,6 +3189,7 @@
         </w:rPr>
         <w:t>•</w:t>
       </w:r>
+      <w:proofErr w:type="gramEnd"/>
       <w:r>
         <w:rPr>
           <w:sz w:val="20"/>
@@ -6049,881 +6062,14 @@
     </w:p>
     <w:p>
       <w:pPr>
-        <w:pStyle w:val="Ttulo2"/>
-        <w:spacing w:after="2"/>
-        <w:ind w:left="-5"/>
-      </w:pPr>
-      <w:bookmarkStart w:id="7" w:name="_Toc7474"/>
-      <w:r>
-        <w:t xml:space="preserve">Recursos Necessários: </w:t>
-      </w:r>
-      <w:bookmarkEnd w:id="7"/>
-    </w:p>
-    <w:tbl>
-      <w:tblPr>
-        <w:tblStyle w:val="TableGrid"/>
-        <w:tblW w:w="6104" w:type="dxa"/>
-        <w:tblInd w:w="46" w:type="dxa"/>
-        <w:tblCellMar>
-          <w:top w:w="0" w:type="dxa"/>
-          <w:left w:w="0" w:type="dxa"/>
-          <w:bottom w:w="0" w:type="dxa"/>
-          <w:right w:w="0" w:type="dxa"/>
-        </w:tblCellMar>
-        <w:tblLook w:val="04A0" w:firstRow="1" w:lastRow="0" w:firstColumn="1" w:lastColumn="0" w:noHBand="0" w:noVBand="1"/>
-      </w:tblPr>
-      <w:tblGrid>
-        <w:gridCol w:w="3315"/>
-        <w:gridCol w:w="2789"/>
-      </w:tblGrid>
-      <w:tr>
-        <w:trPr>
-          <w:trHeight w:val="382"/>
-        </w:trPr>
-        <w:tc>
-          <w:tcPr>
-            <w:tcW w:w="3315" w:type="dxa"/>
-            <w:tcBorders>
-              <w:top w:val="nil"/>
-              <w:left w:val="nil"/>
-              <w:bottom w:val="nil"/>
-              <w:right w:val="nil"/>
-            </w:tcBorders>
-          </w:tcPr>
-          <w:p>
-            <w:pPr>
-              <w:spacing w:after="0" w:line="259" w:lineRule="auto"/>
-              <w:ind w:left="0" w:firstLine="0"/>
-              <w:jc w:val="left"/>
-            </w:pPr>
-            <w:r>
-              <w:rPr>
-                <w:b/>
-              </w:rPr>
-              <w:t xml:space="preserve">Recurso </w:t>
-            </w:r>
-          </w:p>
-        </w:tc>
-        <w:tc>
-          <w:tcPr>
-            <w:tcW w:w="2789" w:type="dxa"/>
-            <w:tcBorders>
-              <w:top w:val="nil"/>
-              <w:left w:val="nil"/>
-              <w:bottom w:val="nil"/>
-              <w:right w:val="nil"/>
-            </w:tcBorders>
-          </w:tcPr>
-          <w:p>
-            <w:pPr>
-              <w:spacing w:after="0" w:line="259" w:lineRule="auto"/>
-              <w:ind w:left="0" w:firstLine="0"/>
-            </w:pPr>
-            <w:r>
-              <w:rPr>
-                <w:b/>
-              </w:rPr>
-              <w:t xml:space="preserve">Carga Horária Estimada </w:t>
-            </w:r>
-          </w:p>
-        </w:tc>
-      </w:tr>
-      <w:tr>
-        <w:trPr>
-          <w:trHeight w:val="539"/>
-        </w:trPr>
-        <w:tc>
-          <w:tcPr>
-            <w:tcW w:w="3315" w:type="dxa"/>
-            <w:tcBorders>
-              <w:top w:val="nil"/>
-              <w:left w:val="nil"/>
-              <w:bottom w:val="nil"/>
-              <w:right w:val="nil"/>
-            </w:tcBorders>
-            <w:vAlign w:val="center"/>
-          </w:tcPr>
-          <w:p>
-            <w:pPr>
-              <w:spacing w:after="0" w:line="259" w:lineRule="auto"/>
-              <w:ind w:left="0" w:firstLine="0"/>
-              <w:jc w:val="left"/>
-            </w:pPr>
-            <w:r>
-              <w:t xml:space="preserve">Gestor de Projeto </w:t>
-            </w:r>
-          </w:p>
-        </w:tc>
-        <w:tc>
-          <w:tcPr>
-            <w:tcW w:w="2789" w:type="dxa"/>
-            <w:tcBorders>
-              <w:top w:val="nil"/>
-              <w:left w:val="nil"/>
-              <w:bottom w:val="nil"/>
-              <w:right w:val="nil"/>
-            </w:tcBorders>
-            <w:vAlign w:val="center"/>
-          </w:tcPr>
-          <w:p>
-            <w:pPr>
-              <w:spacing w:after="0" w:line="259" w:lineRule="auto"/>
-              <w:ind w:left="0" w:firstLine="0"/>
-              <w:jc w:val="left"/>
-            </w:pPr>
-            <w:r>
-              <w:t xml:space="preserve">60 horas </w:t>
-            </w:r>
-          </w:p>
-        </w:tc>
-      </w:tr>
-      <w:tr>
-        <w:trPr>
-          <w:trHeight w:val="539"/>
-        </w:trPr>
-        <w:tc>
-          <w:tcPr>
-            <w:tcW w:w="3315" w:type="dxa"/>
-            <w:tcBorders>
-              <w:top w:val="nil"/>
-              <w:left w:val="nil"/>
-              <w:bottom w:val="nil"/>
-              <w:right w:val="nil"/>
-            </w:tcBorders>
-            <w:vAlign w:val="center"/>
-          </w:tcPr>
-          <w:p>
-            <w:pPr>
-              <w:spacing w:after="0" w:line="259" w:lineRule="auto"/>
-              <w:ind w:left="0" w:firstLine="0"/>
-              <w:jc w:val="left"/>
-            </w:pPr>
-            <w:r>
-              <w:t xml:space="preserve">Designer Web </w:t>
-            </w:r>
-          </w:p>
-        </w:tc>
-        <w:tc>
-          <w:tcPr>
-            <w:tcW w:w="2789" w:type="dxa"/>
-            <w:tcBorders>
-              <w:top w:val="nil"/>
-              <w:left w:val="nil"/>
-              <w:bottom w:val="nil"/>
-              <w:right w:val="nil"/>
-            </w:tcBorders>
-            <w:vAlign w:val="center"/>
-          </w:tcPr>
-          <w:p>
-            <w:pPr>
-              <w:spacing w:after="0" w:line="259" w:lineRule="auto"/>
-              <w:ind w:left="0" w:firstLine="0"/>
-              <w:jc w:val="left"/>
-            </w:pPr>
-            <w:r>
-              <w:t xml:space="preserve">80 horas </w:t>
-            </w:r>
-          </w:p>
-        </w:tc>
-      </w:tr>
-      <w:tr>
-        <w:trPr>
-          <w:trHeight w:val="539"/>
-        </w:trPr>
-        <w:tc>
-          <w:tcPr>
-            <w:tcW w:w="3315" w:type="dxa"/>
-            <w:tcBorders>
-              <w:top w:val="nil"/>
-              <w:left w:val="nil"/>
-              <w:bottom w:val="nil"/>
-              <w:right w:val="nil"/>
-            </w:tcBorders>
-            <w:vAlign w:val="center"/>
-          </w:tcPr>
-          <w:p>
-            <w:pPr>
-              <w:spacing w:after="0" w:line="259" w:lineRule="auto"/>
-              <w:ind w:left="0" w:firstLine="0"/>
-              <w:jc w:val="left"/>
-            </w:pPr>
-            <w:r>
-              <w:t>Desenvolvedor Front-</w:t>
-            </w:r>
-            <w:proofErr w:type="spellStart"/>
-            <w:r>
-              <w:t>end</w:t>
-            </w:r>
-            <w:proofErr w:type="spellEnd"/>
-            <w:r>
-              <w:t xml:space="preserve"> </w:t>
-            </w:r>
-          </w:p>
-        </w:tc>
-        <w:tc>
-          <w:tcPr>
-            <w:tcW w:w="2789" w:type="dxa"/>
-            <w:tcBorders>
-              <w:top w:val="nil"/>
-              <w:left w:val="nil"/>
-              <w:bottom w:val="nil"/>
-              <w:right w:val="nil"/>
-            </w:tcBorders>
-            <w:vAlign w:val="center"/>
-          </w:tcPr>
-          <w:p>
-            <w:pPr>
-              <w:spacing w:after="0" w:line="259" w:lineRule="auto"/>
-              <w:ind w:left="0" w:firstLine="0"/>
-              <w:jc w:val="left"/>
-            </w:pPr>
-            <w:r>
-              <w:t xml:space="preserve">120 horas </w:t>
-            </w:r>
-          </w:p>
-        </w:tc>
-      </w:tr>
-      <w:tr>
-        <w:trPr>
-          <w:trHeight w:val="383"/>
-        </w:trPr>
-        <w:tc>
-          <w:tcPr>
-            <w:tcW w:w="3315" w:type="dxa"/>
-            <w:tcBorders>
-              <w:top w:val="nil"/>
-              <w:left w:val="nil"/>
-              <w:bottom w:val="nil"/>
-              <w:right w:val="nil"/>
-            </w:tcBorders>
-            <w:vAlign w:val="bottom"/>
-          </w:tcPr>
-          <w:p>
-            <w:pPr>
-              <w:spacing w:after="0" w:line="259" w:lineRule="auto"/>
-              <w:ind w:left="0" w:firstLine="0"/>
-              <w:jc w:val="left"/>
-            </w:pPr>
-            <w:r>
-              <w:t xml:space="preserve">Analista de Conteúdo </w:t>
-            </w:r>
-          </w:p>
-        </w:tc>
-        <w:tc>
-          <w:tcPr>
-            <w:tcW w:w="2789" w:type="dxa"/>
-            <w:tcBorders>
-              <w:top w:val="nil"/>
-              <w:left w:val="nil"/>
-              <w:bottom w:val="nil"/>
-              <w:right w:val="nil"/>
-            </w:tcBorders>
-            <w:vAlign w:val="bottom"/>
-          </w:tcPr>
-          <w:p>
-            <w:pPr>
-              <w:spacing w:after="0" w:line="259" w:lineRule="auto"/>
-              <w:ind w:left="0" w:firstLine="0"/>
-              <w:jc w:val="left"/>
-            </w:pPr>
-            <w:r>
-              <w:t xml:space="preserve">80 horas </w:t>
-            </w:r>
-          </w:p>
-        </w:tc>
-      </w:tr>
-    </w:tbl>
-    <w:p>
-      <w:pPr>
-        <w:spacing w:after="272"/>
-        <w:ind w:left="56" w:right="59"/>
-      </w:pPr>
-      <w:r>
-        <w:t xml:space="preserve">Infraestrutura de Hospedagem - </w:t>
-      </w:r>
-    </w:p>
-    <w:p>
-      <w:pPr>
-        <w:spacing w:after="129" w:line="259" w:lineRule="auto"/>
-        <w:ind w:left="0" w:firstLine="0"/>
-        <w:jc w:val="right"/>
-      </w:pPr>
-      <w:r>
-        <w:rPr>
-          <w:rFonts w:ascii="Calibri" w:eastAsia="Calibri" w:hAnsi="Calibri" w:cs="Calibri"/>
-          <w:noProof/>
-          <w:sz w:val="22"/>
-        </w:rPr>
-        <mc:AlternateContent>
-          <mc:Choice Requires="wpg">
-            <w:drawing>
-              <wp:inline distT="0" distB="0" distL="0" distR="0" wp14:anchorId="6D530145" wp14:editId="2464B582">
-                <wp:extent cx="5400548" cy="21209"/>
-                <wp:effectExtent l="0" t="0" r="0" b="0"/>
-                <wp:docPr id="6635" name="Group 6635"/>
-                <wp:cNvGraphicFramePr/>
-                <a:graphic xmlns:a="http://schemas.openxmlformats.org/drawingml/2006/main">
-                  <a:graphicData uri="http://schemas.microsoft.com/office/word/2010/wordprocessingGroup">
-                    <wpg:wgp>
-                      <wpg:cNvGrpSpPr/>
-                      <wpg:grpSpPr>
-                        <a:xfrm>
-                          <a:off x="0" y="0"/>
-                          <a:ext cx="5400548" cy="21209"/>
-                          <a:chOff x="0" y="0"/>
-                          <a:chExt cx="5400548" cy="21209"/>
-                        </a:xfrm>
-                      </wpg:grpSpPr>
-                      <wps:wsp>
-                        <wps:cNvPr id="7824" name="Shape 7824"/>
-                        <wps:cNvSpPr/>
-                        <wps:spPr>
-                          <a:xfrm>
-                            <a:off x="0" y="0"/>
-                            <a:ext cx="5399405" cy="19685"/>
-                          </a:xfrm>
-                          <a:custGeom>
-                            <a:avLst/>
-                            <a:gdLst/>
-                            <a:ahLst/>
-                            <a:cxnLst/>
-                            <a:rect l="0" t="0" r="0" b="0"/>
-                            <a:pathLst>
-                              <a:path w="5399405" h="19685">
-                                <a:moveTo>
-                                  <a:pt x="0" y="0"/>
-                                </a:moveTo>
-                                <a:lnTo>
-                                  <a:pt x="5399405" y="0"/>
-                                </a:lnTo>
-                                <a:lnTo>
-                                  <a:pt x="5399405" y="19685"/>
-                                </a:lnTo>
-                                <a:lnTo>
-                                  <a:pt x="0" y="19685"/>
-                                </a:lnTo>
-                                <a:lnTo>
-                                  <a:pt x="0" y="0"/>
-                                </a:lnTo>
-                              </a:path>
-                            </a:pathLst>
-                          </a:custGeom>
-                          <a:ln w="0" cap="flat">
-                            <a:miter lim="127000"/>
-                          </a:ln>
-                        </wps:spPr>
-                        <wps:style>
-                          <a:lnRef idx="0">
-                            <a:srgbClr val="000000">
-                              <a:alpha val="0"/>
-                            </a:srgbClr>
-                          </a:lnRef>
-                          <a:fillRef idx="1">
-                            <a:srgbClr val="A0A0A0"/>
-                          </a:fillRef>
-                          <a:effectRef idx="0">
-                            <a:scrgbClr r="0" g="0" b="0"/>
-                          </a:effectRef>
-                          <a:fontRef idx="none"/>
-                        </wps:style>
-                        <wps:bodyPr/>
-                      </wps:wsp>
-                      <wps:wsp>
-                        <wps:cNvPr id="7825" name="Shape 7825"/>
-                        <wps:cNvSpPr/>
-                        <wps:spPr>
-                          <a:xfrm>
-                            <a:off x="51" y="1397"/>
-                            <a:ext cx="9144" cy="9144"/>
-                          </a:xfrm>
-                          <a:custGeom>
-                            <a:avLst/>
-                            <a:gdLst/>
-                            <a:ahLst/>
-                            <a:cxnLst/>
-                            <a:rect l="0" t="0" r="0" b="0"/>
-                            <a:pathLst>
-                              <a:path w="9144" h="9144">
-                                <a:moveTo>
-                                  <a:pt x="0" y="0"/>
-                                </a:moveTo>
-                                <a:lnTo>
-                                  <a:pt x="9144" y="0"/>
-                                </a:lnTo>
-                                <a:lnTo>
-                                  <a:pt x="9144" y="9144"/>
-                                </a:lnTo>
-                                <a:lnTo>
-                                  <a:pt x="0" y="9144"/>
-                                </a:lnTo>
-                                <a:lnTo>
-                                  <a:pt x="0" y="0"/>
-                                </a:lnTo>
-                              </a:path>
-                            </a:pathLst>
-                          </a:custGeom>
-                          <a:ln w="0" cap="flat">
-                            <a:miter lim="127000"/>
-                          </a:ln>
-                        </wps:spPr>
-                        <wps:style>
-                          <a:lnRef idx="0">
-                            <a:srgbClr val="000000">
-                              <a:alpha val="0"/>
-                            </a:srgbClr>
-                          </a:lnRef>
-                          <a:fillRef idx="1">
-                            <a:srgbClr val="A0A0A0"/>
-                          </a:fillRef>
-                          <a:effectRef idx="0">
-                            <a:scrgbClr r="0" g="0" b="0"/>
-                          </a:effectRef>
-                          <a:fontRef idx="none"/>
-                        </wps:style>
-                        <wps:bodyPr/>
-                      </wps:wsp>
-                      <wps:wsp>
-                        <wps:cNvPr id="7826" name="Shape 7826"/>
-                        <wps:cNvSpPr/>
-                        <wps:spPr>
-                          <a:xfrm>
-                            <a:off x="3099" y="1397"/>
-                            <a:ext cx="5394325" cy="9144"/>
-                          </a:xfrm>
-                          <a:custGeom>
-                            <a:avLst/>
-                            <a:gdLst/>
-                            <a:ahLst/>
-                            <a:cxnLst/>
-                            <a:rect l="0" t="0" r="0" b="0"/>
-                            <a:pathLst>
-                              <a:path w="5394325" h="9144">
-                                <a:moveTo>
-                                  <a:pt x="0" y="0"/>
-                                </a:moveTo>
-                                <a:lnTo>
-                                  <a:pt x="5394325" y="0"/>
-                                </a:lnTo>
-                                <a:lnTo>
-                                  <a:pt x="5394325" y="9144"/>
-                                </a:lnTo>
-                                <a:lnTo>
-                                  <a:pt x="0" y="9144"/>
-                                </a:lnTo>
-                                <a:lnTo>
-                                  <a:pt x="0" y="0"/>
-                                </a:lnTo>
-                              </a:path>
-                            </a:pathLst>
-                          </a:custGeom>
-                          <a:ln w="0" cap="flat">
-                            <a:miter lim="127000"/>
-                          </a:ln>
-                        </wps:spPr>
-                        <wps:style>
-                          <a:lnRef idx="0">
-                            <a:srgbClr val="000000">
-                              <a:alpha val="0"/>
-                            </a:srgbClr>
-                          </a:lnRef>
-                          <a:fillRef idx="1">
-                            <a:srgbClr val="A0A0A0"/>
-                          </a:fillRef>
-                          <a:effectRef idx="0">
-                            <a:scrgbClr r="0" g="0" b="0"/>
-                          </a:effectRef>
-                          <a:fontRef idx="none"/>
-                        </wps:style>
-                        <wps:bodyPr/>
-                      </wps:wsp>
-                      <wps:wsp>
-                        <wps:cNvPr id="7827" name="Shape 7827"/>
-                        <wps:cNvSpPr/>
-                        <wps:spPr>
-                          <a:xfrm>
-                            <a:off x="5397500" y="1397"/>
-                            <a:ext cx="9144" cy="9144"/>
-                          </a:xfrm>
-                          <a:custGeom>
-                            <a:avLst/>
-                            <a:gdLst/>
-                            <a:ahLst/>
-                            <a:cxnLst/>
-                            <a:rect l="0" t="0" r="0" b="0"/>
-                            <a:pathLst>
-                              <a:path w="9144" h="9144">
-                                <a:moveTo>
-                                  <a:pt x="0" y="0"/>
-                                </a:moveTo>
-                                <a:lnTo>
-                                  <a:pt x="9144" y="0"/>
-                                </a:lnTo>
-                                <a:lnTo>
-                                  <a:pt x="9144" y="9144"/>
-                                </a:lnTo>
-                                <a:lnTo>
-                                  <a:pt x="0" y="9144"/>
-                                </a:lnTo>
-                                <a:lnTo>
-                                  <a:pt x="0" y="0"/>
-                                </a:lnTo>
-                              </a:path>
-                            </a:pathLst>
-                          </a:custGeom>
-                          <a:ln w="0" cap="flat">
-                            <a:miter lim="127000"/>
-                          </a:ln>
-                        </wps:spPr>
-                        <wps:style>
-                          <a:lnRef idx="0">
-                            <a:srgbClr val="000000">
-                              <a:alpha val="0"/>
-                            </a:srgbClr>
-                          </a:lnRef>
-                          <a:fillRef idx="1">
-                            <a:srgbClr val="A0A0A0"/>
-                          </a:fillRef>
-                          <a:effectRef idx="0">
-                            <a:scrgbClr r="0" g="0" b="0"/>
-                          </a:effectRef>
-                          <a:fontRef idx="none"/>
-                        </wps:style>
-                        <wps:bodyPr/>
-                      </wps:wsp>
-                      <wps:wsp>
-                        <wps:cNvPr id="7828" name="Shape 7828"/>
-                        <wps:cNvSpPr/>
-                        <wps:spPr>
-                          <a:xfrm>
-                            <a:off x="51" y="4445"/>
-                            <a:ext cx="9144" cy="13716"/>
-                          </a:xfrm>
-                          <a:custGeom>
-                            <a:avLst/>
-                            <a:gdLst/>
-                            <a:ahLst/>
-                            <a:cxnLst/>
-                            <a:rect l="0" t="0" r="0" b="0"/>
-                            <a:pathLst>
-                              <a:path w="9144" h="13716">
-                                <a:moveTo>
-                                  <a:pt x="0" y="0"/>
-                                </a:moveTo>
-                                <a:lnTo>
-                                  <a:pt x="9144" y="0"/>
-                                </a:lnTo>
-                                <a:lnTo>
-                                  <a:pt x="9144" y="13716"/>
-                                </a:lnTo>
-                                <a:lnTo>
-                                  <a:pt x="0" y="13716"/>
-                                </a:lnTo>
-                                <a:lnTo>
-                                  <a:pt x="0" y="0"/>
-                                </a:lnTo>
-                              </a:path>
-                            </a:pathLst>
-                          </a:custGeom>
-                          <a:ln w="0" cap="flat">
-                            <a:miter lim="127000"/>
-                          </a:ln>
-                        </wps:spPr>
-                        <wps:style>
-                          <a:lnRef idx="0">
-                            <a:srgbClr val="000000">
-                              <a:alpha val="0"/>
-                            </a:srgbClr>
-                          </a:lnRef>
-                          <a:fillRef idx="1">
-                            <a:srgbClr val="A0A0A0"/>
-                          </a:fillRef>
-                          <a:effectRef idx="0">
-                            <a:scrgbClr r="0" g="0" b="0"/>
-                          </a:effectRef>
-                          <a:fontRef idx="none"/>
-                        </wps:style>
-                        <wps:bodyPr/>
-                      </wps:wsp>
-                      <wps:wsp>
-                        <wps:cNvPr id="7829" name="Shape 7829"/>
-                        <wps:cNvSpPr/>
-                        <wps:spPr>
-                          <a:xfrm>
-                            <a:off x="5397500" y="4445"/>
-                            <a:ext cx="9144" cy="13716"/>
-                          </a:xfrm>
-                          <a:custGeom>
-                            <a:avLst/>
-                            <a:gdLst/>
-                            <a:ahLst/>
-                            <a:cxnLst/>
-                            <a:rect l="0" t="0" r="0" b="0"/>
-                            <a:pathLst>
-                              <a:path w="9144" h="13716">
-                                <a:moveTo>
-                                  <a:pt x="0" y="0"/>
-                                </a:moveTo>
-                                <a:lnTo>
-                                  <a:pt x="9144" y="0"/>
-                                </a:lnTo>
-                                <a:lnTo>
-                                  <a:pt x="9144" y="13716"/>
-                                </a:lnTo>
-                                <a:lnTo>
-                                  <a:pt x="0" y="13716"/>
-                                </a:lnTo>
-                                <a:lnTo>
-                                  <a:pt x="0" y="0"/>
-                                </a:lnTo>
-                              </a:path>
-                            </a:pathLst>
-                          </a:custGeom>
-                          <a:ln w="0" cap="flat">
-                            <a:miter lim="127000"/>
-                          </a:ln>
-                        </wps:spPr>
-                        <wps:style>
-                          <a:lnRef idx="0">
-                            <a:srgbClr val="000000">
-                              <a:alpha val="0"/>
-                            </a:srgbClr>
-                          </a:lnRef>
-                          <a:fillRef idx="1">
-                            <a:srgbClr val="E3E3E3"/>
-                          </a:fillRef>
-                          <a:effectRef idx="0">
-                            <a:scrgbClr r="0" g="0" b="0"/>
-                          </a:effectRef>
-                          <a:fontRef idx="none"/>
-                        </wps:style>
-                        <wps:bodyPr/>
-                      </wps:wsp>
-                      <wps:wsp>
-                        <wps:cNvPr id="7830" name="Shape 7830"/>
-                        <wps:cNvSpPr/>
-                        <wps:spPr>
-                          <a:xfrm>
-                            <a:off x="51" y="18161"/>
-                            <a:ext cx="9144" cy="9144"/>
-                          </a:xfrm>
-                          <a:custGeom>
-                            <a:avLst/>
-                            <a:gdLst/>
-                            <a:ahLst/>
-                            <a:cxnLst/>
-                            <a:rect l="0" t="0" r="0" b="0"/>
-                            <a:pathLst>
-                              <a:path w="9144" h="9144">
-                                <a:moveTo>
-                                  <a:pt x="0" y="0"/>
-                                </a:moveTo>
-                                <a:lnTo>
-                                  <a:pt x="9144" y="0"/>
-                                </a:lnTo>
-                                <a:lnTo>
-                                  <a:pt x="9144" y="9144"/>
-                                </a:lnTo>
-                                <a:lnTo>
-                                  <a:pt x="0" y="9144"/>
-                                </a:lnTo>
-                                <a:lnTo>
-                                  <a:pt x="0" y="0"/>
-                                </a:lnTo>
-                              </a:path>
-                            </a:pathLst>
-                          </a:custGeom>
-                          <a:ln w="0" cap="flat">
-                            <a:miter lim="127000"/>
-                          </a:ln>
-                        </wps:spPr>
-                        <wps:style>
-                          <a:lnRef idx="0">
-                            <a:srgbClr val="000000">
-                              <a:alpha val="0"/>
-                            </a:srgbClr>
-                          </a:lnRef>
-                          <a:fillRef idx="1">
-                            <a:srgbClr val="E3E3E3"/>
-                          </a:fillRef>
-                          <a:effectRef idx="0">
-                            <a:scrgbClr r="0" g="0" b="0"/>
-                          </a:effectRef>
-                          <a:fontRef idx="none"/>
-                        </wps:style>
-                        <wps:bodyPr/>
-                      </wps:wsp>
-                      <wps:wsp>
-                        <wps:cNvPr id="7831" name="Shape 7831"/>
-                        <wps:cNvSpPr/>
-                        <wps:spPr>
-                          <a:xfrm>
-                            <a:off x="3099" y="18161"/>
-                            <a:ext cx="5394325" cy="9144"/>
-                          </a:xfrm>
-                          <a:custGeom>
-                            <a:avLst/>
-                            <a:gdLst/>
-                            <a:ahLst/>
-                            <a:cxnLst/>
-                            <a:rect l="0" t="0" r="0" b="0"/>
-                            <a:pathLst>
-                              <a:path w="5394325" h="9144">
-                                <a:moveTo>
-                                  <a:pt x="0" y="0"/>
-                                </a:moveTo>
-                                <a:lnTo>
-                                  <a:pt x="5394325" y="0"/>
-                                </a:lnTo>
-                                <a:lnTo>
-                                  <a:pt x="5394325" y="9144"/>
-                                </a:lnTo>
-                                <a:lnTo>
-                                  <a:pt x="0" y="9144"/>
-                                </a:lnTo>
-                                <a:lnTo>
-                                  <a:pt x="0" y="0"/>
-                                </a:lnTo>
-                              </a:path>
-                            </a:pathLst>
-                          </a:custGeom>
-                          <a:ln w="0" cap="flat">
-                            <a:miter lim="127000"/>
-                          </a:ln>
-                        </wps:spPr>
-                        <wps:style>
-                          <a:lnRef idx="0">
-                            <a:srgbClr val="000000">
-                              <a:alpha val="0"/>
-                            </a:srgbClr>
-                          </a:lnRef>
-                          <a:fillRef idx="1">
-                            <a:srgbClr val="E3E3E3"/>
-                          </a:fillRef>
-                          <a:effectRef idx="0">
-                            <a:scrgbClr r="0" g="0" b="0"/>
-                          </a:effectRef>
-                          <a:fontRef idx="none"/>
-                        </wps:style>
-                        <wps:bodyPr/>
-                      </wps:wsp>
-                      <wps:wsp>
-                        <wps:cNvPr id="7832" name="Shape 7832"/>
-                        <wps:cNvSpPr/>
-                        <wps:spPr>
-                          <a:xfrm>
-                            <a:off x="5397500" y="18161"/>
-                            <a:ext cx="9144" cy="9144"/>
-                          </a:xfrm>
-                          <a:custGeom>
-                            <a:avLst/>
-                            <a:gdLst/>
-                            <a:ahLst/>
-                            <a:cxnLst/>
-                            <a:rect l="0" t="0" r="0" b="0"/>
-                            <a:pathLst>
-                              <a:path w="9144" h="9144">
-                                <a:moveTo>
-                                  <a:pt x="0" y="0"/>
-                                </a:moveTo>
-                                <a:lnTo>
-                                  <a:pt x="9144" y="0"/>
-                                </a:lnTo>
-                                <a:lnTo>
-                                  <a:pt x="9144" y="9144"/>
-                                </a:lnTo>
-                                <a:lnTo>
-                                  <a:pt x="0" y="9144"/>
-                                </a:lnTo>
-                                <a:lnTo>
-                                  <a:pt x="0" y="0"/>
-                                </a:lnTo>
-                              </a:path>
-                            </a:pathLst>
-                          </a:custGeom>
-                          <a:ln w="0" cap="flat">
-                            <a:miter lim="127000"/>
-                          </a:ln>
-                        </wps:spPr>
-                        <wps:style>
-                          <a:lnRef idx="0">
-                            <a:srgbClr val="000000">
-                              <a:alpha val="0"/>
-                            </a:srgbClr>
-                          </a:lnRef>
-                          <a:fillRef idx="1">
-                            <a:srgbClr val="E3E3E3"/>
-                          </a:fillRef>
-                          <a:effectRef idx="0">
-                            <a:scrgbClr r="0" g="0" b="0"/>
-                          </a:effectRef>
-                          <a:fontRef idx="none"/>
-                        </wps:style>
-                        <wps:bodyPr/>
-                      </wps:wsp>
-                    </wpg:wgp>
-                  </a:graphicData>
-                </a:graphic>
-              </wp:inline>
-            </w:drawing>
-          </mc:Choice>
-          <mc:Fallback xmlns:a="http://schemas.openxmlformats.org/drawingml/2006/main">
-            <w:pict>
-              <v:group id="Group 6635" style="width:425.24pt;height:1.66998pt;mso-position-horizontal-relative:char;mso-position-vertical-relative:line" coordsize="54005,212">
-                <v:shape id="Shape 7833" style="position:absolute;width:53994;height:196;left:0;top:0;" coordsize="5399405,19685" path="m0,0l5399405,0l5399405,19685l0,19685l0,0">
-                  <v:stroke weight="0pt" endcap="flat" joinstyle="miter" miterlimit="10" on="false" color="#000000" opacity="0"/>
-                  <v:fill on="true" color="#a0a0a0"/>
-                </v:shape>
-                <v:shape id="Shape 7834" style="position:absolute;width:91;height:91;left:0;top:13;" coordsize="9144,9144" path="m0,0l9144,0l9144,9144l0,9144l0,0">
-                  <v:stroke weight="0pt" endcap="flat" joinstyle="miter" miterlimit="10" on="false" color="#000000" opacity="0"/>
-                  <v:fill on="true" color="#a0a0a0"/>
-                </v:shape>
-                <v:shape id="Shape 7835" style="position:absolute;width:53943;height:91;left:30;top:13;" coordsize="5394325,9144" path="m0,0l5394325,0l5394325,9144l0,9144l0,0">
-                  <v:stroke weight="0pt" endcap="flat" joinstyle="miter" miterlimit="10" on="false" color="#000000" opacity="0"/>
-                  <v:fill on="true" color="#a0a0a0"/>
-                </v:shape>
-                <v:shape id="Shape 7836" style="position:absolute;width:91;height:91;left:53975;top:13;" coordsize="9144,9144" path="m0,0l9144,0l9144,9144l0,9144l0,0">
-                  <v:stroke weight="0pt" endcap="flat" joinstyle="miter" miterlimit="10" on="false" color="#000000" opacity="0"/>
-                  <v:fill on="true" color="#a0a0a0"/>
-                </v:shape>
-                <v:shape id="Shape 7837" style="position:absolute;width:91;height:137;left:0;top:44;" coordsize="9144,13716" path="m0,0l9144,0l9144,13716l0,13716l0,0">
-                  <v:stroke weight="0pt" endcap="flat" joinstyle="miter" miterlimit="10" on="false" color="#000000" opacity="0"/>
-                  <v:fill on="true" color="#a0a0a0"/>
-                </v:shape>
-                <v:shape id="Shape 7838" style="position:absolute;width:91;height:137;left:53975;top:44;" coordsize="9144,13716" path="m0,0l9144,0l9144,13716l0,13716l0,0">
-                  <v:stroke weight="0pt" endcap="flat" joinstyle="miter" miterlimit="10" on="false" color="#000000" opacity="0"/>
-                  <v:fill on="true" color="#e3e3e3"/>
-                </v:shape>
-                <v:shape id="Shape 7839" style="position:absolute;width:91;height:91;left:0;top:181;" coordsize="9144,9144" path="m0,0l9144,0l9144,9144l0,9144l0,0">
-                  <v:stroke weight="0pt" endcap="flat" joinstyle="miter" miterlimit="10" on="false" color="#000000" opacity="0"/>
-                  <v:fill on="true" color="#e3e3e3"/>
-                </v:shape>
-                <v:shape id="Shape 7840" style="position:absolute;width:53943;height:91;left:30;top:181;" coordsize="5394325,9144" path="m0,0l5394325,0l5394325,9144l0,9144l0,0">
-                  <v:stroke weight="0pt" endcap="flat" joinstyle="miter" miterlimit="10" on="false" color="#000000" opacity="0"/>
-                  <v:fill on="true" color="#e3e3e3"/>
-                </v:shape>
-                <v:shape id="Shape 7841" style="position:absolute;width:91;height:91;left:53975;top:181;" coordsize="9144,9144" path="m0,0l9144,0l9144,9144l0,9144l0,0">
-                  <v:stroke weight="0pt" endcap="flat" joinstyle="miter" miterlimit="10" on="false" color="#000000" opacity="0"/>
-                  <v:fill on="true" color="#e3e3e3"/>
-                </v:shape>
-              </v:group>
-            </w:pict>
-          </mc:Fallback>
-        </mc:AlternateContent>
-      </w:r>
-      <w:r>
-        <w:t xml:space="preserve"> </w:t>
-      </w:r>
-    </w:p>
-    <w:p>
-      <w:pPr>
         <w:pStyle w:val="Ttulo3"/>
         <w:ind w:left="-5"/>
       </w:pPr>
-      <w:bookmarkStart w:id="8" w:name="_Toc7475"/>
+      <w:bookmarkStart w:id="7" w:name="_Toc7475"/>
       <w:r>
         <w:t xml:space="preserve">Riscos e Restrições: </w:t>
       </w:r>
-      <w:bookmarkEnd w:id="8"/>
+      <w:bookmarkEnd w:id="7"/>
     </w:p>
     <w:p>
       <w:pPr>
@@ -7008,70 +6154,6 @@
       </w:pPr>
       <w:r>
         <w:t xml:space="preserve">Baixa adesão do público caso o conteúdo não seja atrativo.  </w:t>
-      </w:r>
-    </w:p>
-    <w:p>
-      <w:pPr>
-        <w:spacing w:after="182" w:line="259" w:lineRule="auto"/>
-        <w:ind w:left="-5"/>
-        <w:jc w:val="left"/>
-      </w:pPr>
-      <w:r>
-        <w:rPr>
-          <w:b/>
-        </w:rPr>
-        <w:t xml:space="preserve">Restrições: </w:t>
-      </w:r>
-    </w:p>
-    <w:p>
-      <w:pPr>
-        <w:numPr>
-          <w:ilvl w:val="0"/>
-          <w:numId w:val="3"/>
-        </w:numPr>
-        <w:ind w:right="59" w:hanging="360"/>
-      </w:pPr>
-      <w:r>
-        <w:t xml:space="preserve">Projeto de caráter apenas informativo (não comercial);  </w:t>
-      </w:r>
-    </w:p>
-    <w:p>
-      <w:pPr>
-        <w:numPr>
-          <w:ilvl w:val="0"/>
-          <w:numId w:val="3"/>
-        </w:numPr>
-        <w:ind w:right="59" w:hanging="360"/>
-      </w:pPr>
-      <w:r>
-        <w:lastRenderedPageBreak/>
-        <w:t xml:space="preserve">Dependência de acesso à internet para utilização;  </w:t>
-      </w:r>
-    </w:p>
-    <w:p>
-      <w:pPr>
-        <w:numPr>
-          <w:ilvl w:val="0"/>
-          <w:numId w:val="3"/>
-        </w:numPr>
-        <w:spacing w:after="0" w:line="417" w:lineRule="auto"/>
-        <w:ind w:right="59" w:hanging="360"/>
-      </w:pPr>
-      <w:r>
-        <w:t xml:space="preserve">Limitação de recursos para desenvolvimento; </w:t>
-      </w:r>
-    </w:p>
-    <w:p>
-      <w:pPr>
-        <w:numPr>
-          <w:ilvl w:val="0"/>
-          <w:numId w:val="3"/>
-        </w:numPr>
-        <w:spacing w:after="0" w:line="417" w:lineRule="auto"/>
-        <w:ind w:right="59" w:hanging="360"/>
-      </w:pPr>
-      <w:r>
-        <w:t xml:space="preserve">Prazo definido para entrega do projeto.  </w:t>
       </w:r>
     </w:p>
     <w:p>
@@ -8245,9 +7327,9 @@
       <w:pPr>
         <w:numPr>
           <w:ilvl w:val="0"/>
-          <w:numId w:val="5"/>
+          <w:numId w:val="6"/>
         </w:numPr>
-        <w:ind w:right="59" w:hanging="360"/>
+        <w:ind w:right="59"/>
       </w:pPr>
       <w:r>
         <w:t xml:space="preserve">Prazo definido para entrega do projeto;  </w:t>
@@ -8255,27 +7337,36 @@
     </w:p>
     <w:p>
       <w:pPr>
+        <w:pStyle w:val="PargrafodaLista"/>
         <w:numPr>
           <w:ilvl w:val="0"/>
-          <w:numId w:val="5"/>
+          <w:numId w:val="6"/>
         </w:numPr>
-        <w:ind w:right="59" w:hanging="360"/>
-      </w:pPr>
-      <w:r>
+        <w:ind w:right="59"/>
+      </w:pPr>
+      <w:r>
+        <w:lastRenderedPageBreak/>
         <w:t xml:space="preserve">Projeto sem funcionalidades avançadas (como sistemas ou banco de dados complexos);  </w:t>
       </w:r>
     </w:p>
     <w:p>
       <w:pPr>
+        <w:pStyle w:val="PargrafodaLista"/>
         <w:numPr>
           <w:ilvl w:val="0"/>
-          <w:numId w:val="5"/>
+          <w:numId w:val="6"/>
         </w:numPr>
         <w:spacing w:after="227"/>
-        <w:ind w:right="59" w:hanging="360"/>
-      </w:pPr>
-      <w:r>
-        <w:t xml:space="preserve">Dependência de </w:t>
+        <w:ind w:right="59"/>
+      </w:pPr>
+      <w:r>
+        <w:t>Dependência d</w:t>
+      </w:r>
+      <w:r>
+        <w:t>o orçamento de</w:t>
+      </w:r>
+      <w:r>
+        <w:t xml:space="preserve"> </w:t>
       </w:r>
       <w:r>
         <w:rPr>
@@ -8286,6 +7377,62 @@
       <w:r>
         <w:t xml:space="preserve"> para publicação do site;  </w:t>
       </w:r>
+    </w:p>
+    <w:p>
+      <w:pPr>
+        <w:numPr>
+          <w:ilvl w:val="0"/>
+          <w:numId w:val="6"/>
+        </w:numPr>
+        <w:ind w:right="59"/>
+      </w:pPr>
+      <w:r>
+        <w:t xml:space="preserve">Projeto de caráter apenas informativo (não comercial);  </w:t>
+      </w:r>
+    </w:p>
+    <w:p>
+      <w:pPr>
+        <w:numPr>
+          <w:ilvl w:val="0"/>
+          <w:numId w:val="6"/>
+        </w:numPr>
+        <w:ind w:right="59"/>
+      </w:pPr>
+      <w:r>
+        <w:t xml:space="preserve">Dependência de acesso à internet para utilização;  </w:t>
+      </w:r>
+    </w:p>
+    <w:p>
+      <w:pPr>
+        <w:numPr>
+          <w:ilvl w:val="0"/>
+          <w:numId w:val="6"/>
+        </w:numPr>
+        <w:spacing w:after="0" w:line="417" w:lineRule="auto"/>
+        <w:ind w:right="59"/>
+      </w:pPr>
+      <w:r>
+        <w:t xml:space="preserve">Limitação de recursos para desenvolvimento; </w:t>
+      </w:r>
+    </w:p>
+    <w:p>
+      <w:pPr>
+        <w:numPr>
+          <w:ilvl w:val="0"/>
+          <w:numId w:val="6"/>
+        </w:numPr>
+        <w:spacing w:after="0" w:line="417" w:lineRule="auto"/>
+        <w:ind w:right="59"/>
+      </w:pPr>
+      <w:r>
+        <w:t xml:space="preserve">Prazo definido para entrega do projeto.  </w:t>
+      </w:r>
+    </w:p>
+    <w:p>
+      <w:pPr>
+        <w:spacing w:after="227"/>
+        <w:ind w:left="705" w:right="59" w:firstLine="0"/>
+      </w:pPr>
     </w:p>
     <w:p>
       <w:pPr>
@@ -8949,7 +8096,6 @@
         <w:ind w:left="10" w:right="59"/>
       </w:pPr>
       <w:r>
-        <w:lastRenderedPageBreak/>
         <w:t xml:space="preserve">Dessa forma, a utilização da metodologia Scrum no projeto </w:t>
       </w:r>
       <w:proofErr w:type="spellStart"/>
@@ -8974,8 +8120,185 @@
         <w:jc w:val="left"/>
       </w:pPr>
       <w:r>
+        <w:lastRenderedPageBreak/>
         <w:t xml:space="preserve"> </w:t>
       </w:r>
+      <w:r>
+        <w:t>TREELLO:</w:t>
+      </w:r>
+      <w:r>
+        <w:rPr>
+          <w:noProof/>
+        </w:rPr>
+        <w:drawing>
+          <wp:inline distT="0" distB="0" distL="0" distR="0" wp14:anchorId="6BE8AFAB" wp14:editId="0DD3A013">
+            <wp:extent cx="5442585" cy="2409825"/>
+            <wp:effectExtent l="0" t="0" r="5715" b="9525"/>
+            <wp:docPr id="513116315" name="Imagem 1"/>
+            <wp:cNvGraphicFramePr>
+              <a:graphicFrameLocks xmlns:a="http://schemas.openxmlformats.org/drawingml/2006/main" noChangeAspect="1"/>
+            </wp:cNvGraphicFramePr>
+            <a:graphic xmlns:a="http://schemas.openxmlformats.org/drawingml/2006/main">
+              <a:graphicData uri="http://schemas.openxmlformats.org/drawingml/2006/picture">
+                <pic:pic xmlns:pic="http://schemas.openxmlformats.org/drawingml/2006/picture">
+                  <pic:nvPicPr>
+                    <pic:cNvPr id="513116315" name=""/>
+                    <pic:cNvPicPr/>
+                  </pic:nvPicPr>
+                  <pic:blipFill>
+                    <a:blip r:embed="rId10"/>
+                    <a:stretch>
+                      <a:fillRect/>
+                    </a:stretch>
+                  </pic:blipFill>
+                  <pic:spPr>
+                    <a:xfrm>
+                      <a:off x="0" y="0"/>
+                      <a:ext cx="5442585" cy="2409825"/>
+                    </a:xfrm>
+                    <a:prstGeom prst="rect">
+                      <a:avLst/>
+                    </a:prstGeom>
+                  </pic:spPr>
+                </pic:pic>
+              </a:graphicData>
+            </a:graphic>
+          </wp:inline>
+        </w:drawing>
+      </w:r>
+    </w:p>
+    <w:p>
+      <w:pPr>
+        <w:spacing w:after="182" w:line="259" w:lineRule="auto"/>
+        <w:ind w:left="0" w:firstLine="0"/>
+        <w:jc w:val="left"/>
+      </w:pPr>
+    </w:p>
+    <w:p>
+      <w:pPr>
+        <w:spacing w:after="182" w:line="259" w:lineRule="auto"/>
+        <w:ind w:left="0" w:firstLine="0"/>
+        <w:jc w:val="left"/>
+      </w:pPr>
+      <w:r>
+        <w:t>BANCO DE DADOS NA VM:</w:t>
+      </w:r>
+    </w:p>
+    <w:p>
+      <w:pPr>
+        <w:spacing w:after="182" w:line="259" w:lineRule="auto"/>
+        <w:ind w:left="0" w:firstLine="0"/>
+        <w:jc w:val="left"/>
+      </w:pPr>
+      <w:r>
+        <w:drawing>
+          <wp:inline distT="0" distB="0" distL="0" distR="0" wp14:anchorId="3C696588" wp14:editId="07C9AFD7">
+            <wp:extent cx="5442585" cy="2178685"/>
+            <wp:effectExtent l="0" t="0" r="5715" b="0"/>
+            <wp:docPr id="1148646090" name="Imagem 1"/>
+            <wp:cNvGraphicFramePr>
+              <a:graphicFrameLocks xmlns:a="http://schemas.openxmlformats.org/drawingml/2006/main" noChangeAspect="1"/>
+            </wp:cNvGraphicFramePr>
+            <a:graphic xmlns:a="http://schemas.openxmlformats.org/drawingml/2006/main">
+              <a:graphicData uri="http://schemas.openxmlformats.org/drawingml/2006/picture">
+                <pic:pic xmlns:pic="http://schemas.openxmlformats.org/drawingml/2006/picture">
+                  <pic:nvPicPr>
+                    <pic:cNvPr id="1148646090" name=""/>
+                    <pic:cNvPicPr/>
+                  </pic:nvPicPr>
+                  <pic:blipFill>
+                    <a:blip r:embed="rId11"/>
+                    <a:stretch>
+                      <a:fillRect/>
+                    </a:stretch>
+                  </pic:blipFill>
+                  <pic:spPr>
+                    <a:xfrm>
+                      <a:off x="0" y="0"/>
+                      <a:ext cx="5442585" cy="2178685"/>
+                    </a:xfrm>
+                    <a:prstGeom prst="rect">
+                      <a:avLst/>
+                    </a:prstGeom>
+                  </pic:spPr>
+                </pic:pic>
+              </a:graphicData>
+            </a:graphic>
+          </wp:inline>
+        </w:drawing>
+      </w:r>
+    </w:p>
+    <w:p>
+      <w:pPr>
+        <w:spacing w:after="182" w:line="259" w:lineRule="auto"/>
+        <w:ind w:left="0" w:firstLine="0"/>
+        <w:jc w:val="left"/>
+      </w:pPr>
+      <w:r>
+        <w:drawing>
+          <wp:inline distT="0" distB="0" distL="0" distR="0" wp14:anchorId="61447DF3" wp14:editId="3AB8C2CC">
+            <wp:extent cx="5442585" cy="1645920"/>
+            <wp:effectExtent l="0" t="0" r="5715" b="0"/>
+            <wp:docPr id="1916064" name="Imagem 1"/>
+            <wp:cNvGraphicFramePr>
+              <a:graphicFrameLocks xmlns:a="http://schemas.openxmlformats.org/drawingml/2006/main" noChangeAspect="1"/>
+            </wp:cNvGraphicFramePr>
+            <a:graphic xmlns:a="http://schemas.openxmlformats.org/drawingml/2006/main">
+              <a:graphicData uri="http://schemas.openxmlformats.org/drawingml/2006/picture">
+                <pic:pic xmlns:pic="http://schemas.openxmlformats.org/drawingml/2006/picture">
+                  <pic:nvPicPr>
+                    <pic:cNvPr id="1916064" name=""/>
+                    <pic:cNvPicPr/>
+                  </pic:nvPicPr>
+                  <pic:blipFill>
+                    <a:blip r:embed="rId12"/>
+                    <a:stretch>
+                      <a:fillRect/>
+                    </a:stretch>
+                  </pic:blipFill>
+                  <pic:spPr>
+                    <a:xfrm>
+                      <a:off x="0" y="0"/>
+                      <a:ext cx="5443058" cy="1646063"/>
+                    </a:xfrm>
+                    <a:prstGeom prst="rect">
+                      <a:avLst/>
+                    </a:prstGeom>
+                  </pic:spPr>
+                </pic:pic>
+              </a:graphicData>
+            </a:graphic>
+          </wp:inline>
+        </w:drawing>
+      </w:r>
+    </w:p>
+    <w:p>
+      <w:pPr>
+        <w:spacing w:after="182" w:line="259" w:lineRule="auto"/>
+        <w:ind w:left="0" w:firstLine="0"/>
+        <w:jc w:val="left"/>
+      </w:pPr>
+    </w:p>
+    <w:p>
+      <w:pPr>
+        <w:spacing w:after="182" w:line="259" w:lineRule="auto"/>
+        <w:ind w:left="0" w:firstLine="0"/>
+        <w:jc w:val="left"/>
+      </w:pPr>
+    </w:p>
+    <w:p>
+      <w:pPr>
+        <w:spacing w:after="182" w:line="259" w:lineRule="auto"/>
+        <w:ind w:left="0" w:firstLine="0"/>
+        <w:jc w:val="left"/>
+      </w:pPr>
+    </w:p>
+    <w:p>
+      <w:pPr>
+        <w:spacing w:after="182" w:line="259" w:lineRule="auto"/>
+        <w:ind w:left="0" w:firstLine="0"/>
+        <w:jc w:val="left"/>
+      </w:pPr>
     </w:p>
     <w:p>
       <w:pPr>
@@ -8995,6 +8318,7 @@
         <w:ind w:left="10" w:right="59"/>
       </w:pPr>
       <w:r>
+        <w:lastRenderedPageBreak/>
         <w:t xml:space="preserve">O desenvolvimento do projeto </w:t>
       </w:r>
       <w:proofErr w:type="spellStart"/>
@@ -9057,9 +8381,9 @@
       </w:r>
     </w:p>
     <w:sectPr>
-      <w:footerReference w:type="even" r:id="rId10"/>
-      <w:footerReference w:type="default" r:id="rId11"/>
-      <w:footerReference w:type="first" r:id="rId12"/>
+      <w:footerReference w:type="even" r:id="rId13"/>
+      <w:footerReference w:type="default" r:id="rId14"/>
+      <w:footerReference w:type="first" r:id="rId15"/>
       <w:pgSz w:w="11906" w:h="16838"/>
       <w:pgMar w:top="1467" w:right="1633" w:bottom="1421" w:left="1702" w:header="720" w:footer="705" w:gutter="0"/>
       <w:cols w:space="720"/>
@@ -9877,6 +9201,119 @@
     </w:lvl>
   </w:abstractNum>
   <w:abstractNum w:abstractNumId="3" w15:restartNumberingAfterBreak="0">
+    <w:nsid w:val="3D7F72FC"/>
+    <w:multiLevelType w:val="hybridMultilevel"/>
+    <w:tmpl w:val="EC5C2CCC"/>
+    <w:lvl w:ilvl="0" w:tplc="04160001">
+      <w:start w:val="1"/>
+      <w:numFmt w:val="bullet"/>
+      <w:lvlText w:val=""/>
+      <w:lvlJc w:val="left"/>
+      <w:pPr>
+        <w:ind w:left="720" w:hanging="360"/>
+      </w:pPr>
+      <w:rPr>
+        <w:rFonts w:ascii="Symbol" w:hAnsi="Symbol" w:hint="default"/>
+      </w:rPr>
+    </w:lvl>
+    <w:lvl w:ilvl="1" w:tplc="04160003" w:tentative="1">
+      <w:start w:val="1"/>
+      <w:numFmt w:val="bullet"/>
+      <w:lvlText w:val="o"/>
+      <w:lvlJc w:val="left"/>
+      <w:pPr>
+        <w:ind w:left="1440" w:hanging="360"/>
+      </w:pPr>
+      <w:rPr>
+        <w:rFonts w:ascii="Courier New" w:hAnsi="Courier New" w:cs="Courier New" w:hint="default"/>
+      </w:rPr>
+    </w:lvl>
+    <w:lvl w:ilvl="2" w:tplc="04160005" w:tentative="1">
+      <w:start w:val="1"/>
+      <w:numFmt w:val="bullet"/>
+      <w:lvlText w:val=""/>
+      <w:lvlJc w:val="left"/>
+      <w:pPr>
+        <w:ind w:left="2160" w:hanging="360"/>
+      </w:pPr>
+      <w:rPr>
+        <w:rFonts w:ascii="Wingdings" w:hAnsi="Wingdings" w:hint="default"/>
+      </w:rPr>
+    </w:lvl>
+    <w:lvl w:ilvl="3" w:tplc="04160001" w:tentative="1">
+      <w:start w:val="1"/>
+      <w:numFmt w:val="bullet"/>
+      <w:lvlText w:val=""/>
+      <w:lvlJc w:val="left"/>
+      <w:pPr>
+        <w:ind w:left="2880" w:hanging="360"/>
+      </w:pPr>
+      <w:rPr>
+        <w:rFonts w:ascii="Symbol" w:hAnsi="Symbol" w:hint="default"/>
+      </w:rPr>
+    </w:lvl>
+    <w:lvl w:ilvl="4" w:tplc="04160003" w:tentative="1">
+      <w:start w:val="1"/>
+      <w:numFmt w:val="bullet"/>
+      <w:lvlText w:val="o"/>
+      <w:lvlJc w:val="left"/>
+      <w:pPr>
+        <w:ind w:left="3600" w:hanging="360"/>
+      </w:pPr>
+      <w:rPr>
+        <w:rFonts w:ascii="Courier New" w:hAnsi="Courier New" w:cs="Courier New" w:hint="default"/>
+      </w:rPr>
+    </w:lvl>
+    <w:lvl w:ilvl="5" w:tplc="04160005" w:tentative="1">
+      <w:start w:val="1"/>
+      <w:numFmt w:val="bullet"/>
+      <w:lvlText w:val=""/>
+      <w:lvlJc w:val="left"/>
+      <w:pPr>
+        <w:ind w:left="4320" w:hanging="360"/>
+      </w:pPr>
+      <w:rPr>
+        <w:rFonts w:ascii="Wingdings" w:hAnsi="Wingdings" w:hint="default"/>
+      </w:rPr>
+    </w:lvl>
+    <w:lvl w:ilvl="6" w:tplc="04160001" w:tentative="1">
+      <w:start w:val="1"/>
+      <w:numFmt w:val="bullet"/>
+      <w:lvlText w:val=""/>
+      <w:lvlJc w:val="left"/>
+      <w:pPr>
+        <w:ind w:left="5040" w:hanging="360"/>
+      </w:pPr>
+      <w:rPr>
+        <w:rFonts w:ascii="Symbol" w:hAnsi="Symbol" w:hint="default"/>
+      </w:rPr>
+    </w:lvl>
+    <w:lvl w:ilvl="7" w:tplc="04160003" w:tentative="1">
+      <w:start w:val="1"/>
+      <w:numFmt w:val="bullet"/>
+      <w:lvlText w:val="o"/>
+      <w:lvlJc w:val="left"/>
+      <w:pPr>
+        <w:ind w:left="5760" w:hanging="360"/>
+      </w:pPr>
+      <w:rPr>
+        <w:rFonts w:ascii="Courier New" w:hAnsi="Courier New" w:cs="Courier New" w:hint="default"/>
+      </w:rPr>
+    </w:lvl>
+    <w:lvl w:ilvl="8" w:tplc="04160005" w:tentative="1">
+      <w:start w:val="1"/>
+      <w:numFmt w:val="bullet"/>
+      <w:lvlText w:val=""/>
+      <w:lvlJc w:val="left"/>
+      <w:pPr>
+        <w:ind w:left="6480" w:hanging="360"/>
+      </w:pPr>
+      <w:rPr>
+        <w:rFonts w:ascii="Wingdings" w:hAnsi="Wingdings" w:hint="default"/>
+      </w:rPr>
+    </w:lvl>
+  </w:abstractNum>
+  <w:abstractNum w:abstractNumId="4" w15:restartNumberingAfterBreak="0">
     <w:nsid w:val="49FD3C9E"/>
     <w:multiLevelType w:val="hybridMultilevel"/>
     <w:tmpl w:val="82E8818A"/>
@@ -10088,7 +9525,7 @@
       </w:rPr>
     </w:lvl>
   </w:abstractNum>
-  <w:abstractNum w:abstractNumId="4" w15:restartNumberingAfterBreak="0">
+  <w:abstractNum w:abstractNumId="5" w15:restartNumberingAfterBreak="0">
     <w:nsid w:val="67341439"/>
     <w:multiLevelType w:val="hybridMultilevel"/>
     <w:tmpl w:val="0AF6FE20"/>
@@ -10307,13 +9744,16 @@
     <w:abstractNumId w:val="1"/>
   </w:num>
   <w:num w:numId="3" w16cid:durableId="2120908221">
-    <w:abstractNumId w:val="3"/>
+    <w:abstractNumId w:val="4"/>
   </w:num>
   <w:num w:numId="4" w16cid:durableId="1200782089">
     <w:abstractNumId w:val="0"/>
   </w:num>
   <w:num w:numId="5" w16cid:durableId="1313678246">
-    <w:abstractNumId w:val="4"/>
+    <w:abstractNumId w:val="5"/>
+  </w:num>
+  <w:num w:numId="6" w16cid:durableId="1824421833">
+    <w:abstractNumId w:val="3"/>
   </w:num>
 </w:numbering>
 </file>
@@ -10980,6 +10420,17 @@
       </w:tblCellMar>
     </w:tblPr>
   </w:style>
+  <w:style w:type="paragraph" w:styleId="PargrafodaLista">
+    <w:name w:val="List Paragraph"/>
+    <w:basedOn w:val="Normal"/>
+    <w:uiPriority w:val="34"/>
+    <w:qFormat/>
+    <w:rsid w:val="003F1A1D"/>
+    <w:pPr>
+      <w:ind w:left="720"/>
+      <w:contextualSpacing/>
+    </w:pPr>
+  </w:style>
 </w:styles>
 </file>
 

</xml_diff>